<commit_message>
Fix final report layout
(cherry picked from commit 412ce4b49bbe479cc0c98961e6f41513f8dca9f7)
</commit_message>
<xml_diff>
--- a/final-submission/GROUP_1.docx
+++ b/final-submission/GROUP_1.docx
@@ -3064,38 +3064,10 @@
       </w:r>
     </w:p>
     <w:p>
-      <w:pPr>
-        <w:sectPr>
-          <w:headerReference w:type="default" r:id="rId9"/>
-          <w:footerReference w:type="default" r:id="rId10"/>
-          <w:pgSz w:w="11909" w:h="16834"/>
-          <w:pgMar w:top="1123" w:right="1181" w:bottom="1123" w:left="1181" w:header="504" w:footer="504" w:gutter="0"/>
-          <w:cols w:space="720"/>
-          <w:docGrid w:linePitch="360"/>
-        </w:sectPr>
-      </w:pPr>
-    </w:p>
-    <w:p>
-      <w:pPr>
-        <w:pStyle w:val="Heading2"/>
-        <w:keepNext/>
-        <w:spacing w:before="200" w:after="120"/>
-      </w:pPr>
-      <w:r>
-        <w:rPr>
-          <w:rFonts w:ascii="Calibri" w:hAnsi="Calibri"/>
-          <w:b/>
-          <w:color w:val="2E74B5"/>
-          <w:sz w:val="26"/>
-        </w:rPr>
-        <w:t>WBS First Version Diagram</w:t>
-      </w:r>
-    </w:p>
-    <w:p>
       <w:r>
         <w:drawing>
           <wp:inline xmlns:a="http://schemas.openxmlformats.org/drawingml/2006/main" xmlns:pic="http://schemas.openxmlformats.org/drawingml/2006/picture">
-            <wp:extent cx="9646920" cy="865910"/>
+            <wp:extent cx="5715000" cy="3333750"/>
             <wp:docPr id="3" name="Picture 3"/>
             <wp:cNvGraphicFramePr>
               <a:graphicFrameLocks noChangeAspect="1"/>
@@ -3116,7 +3088,7 @@
                   <pic:spPr>
                     <a:xfrm>
                       <a:off x="0" y="0"/>
-                      <a:ext cx="9646920" cy="865910"/>
+                      <a:ext cx="5715000" cy="3333750"/>
                     </a:xfrm>
                     <a:prstGeom prst="rect"/>
                   </pic:spPr>
@@ -3141,16 +3113,6 @@
         </w:rPr>
         <w:t>Figure 3: WBS version 1.</w:t>
       </w:r>
-    </w:p>
-    <w:p>
-      <w:pPr>
-        <w:sectPr>
-          <w:pgSz w:w="16834" w:h="11909" w:orient="landscape"/>
-          <w:pgMar w:top="648" w:right="720" w:bottom="648" w:left="720" w:header="504" w:footer="504" w:gutter="0"/>
-          <w:cols w:space="720"/>
-          <w:docGrid w:linePitch="360"/>
-        </w:sectPr>
-      </w:pPr>
     </w:p>
     <w:p>
       <w:pPr>
@@ -3557,36 +3519,10 @@
       </w:r>
     </w:p>
     <w:p>
-      <w:pPr>
-        <w:sectPr>
-          <w:pgSz w:w="11909" w:h="16834"/>
-          <w:pgMar w:top="1123" w:right="1181" w:bottom="1123" w:left="1181" w:header="504" w:footer="504" w:gutter="0"/>
-          <w:cols w:space="720"/>
-          <w:docGrid w:linePitch="360"/>
-        </w:sectPr>
-      </w:pPr>
-    </w:p>
-    <w:p>
-      <w:pPr>
-        <w:pStyle w:val="Heading2"/>
-        <w:keepNext/>
-        <w:spacing w:before="200" w:after="120"/>
-      </w:pPr>
-      <w:r>
-        <w:rPr>
-          <w:rFonts w:ascii="Calibri" w:hAnsi="Calibri"/>
-          <w:b/>
-          <w:color w:val="2E74B5"/>
-          <w:sz w:val="26"/>
-        </w:rPr>
-        <w:t>WBS Final Version Diagram</w:t>
-      </w:r>
-    </w:p>
-    <w:p>
       <w:r>
         <w:drawing>
           <wp:inline xmlns:a="http://schemas.openxmlformats.org/drawingml/2006/main" xmlns:pic="http://schemas.openxmlformats.org/drawingml/2006/picture">
-            <wp:extent cx="9646920" cy="646708"/>
+            <wp:extent cx="5715000" cy="3333750"/>
             <wp:docPr id="4" name="Picture 4"/>
             <wp:cNvGraphicFramePr>
               <a:graphicFrameLocks noChangeAspect="1"/>
@@ -3607,7 +3543,7 @@
                   <pic:spPr>
                     <a:xfrm>
                       <a:off x="0" y="0"/>
-                      <a:ext cx="9646920" cy="646708"/>
+                      <a:ext cx="5715000" cy="3333750"/>
                     </a:xfrm>
                     <a:prstGeom prst="rect"/>
                   </pic:spPr>
@@ -3632,16 +3568,6 @@
         </w:rPr>
         <w:t>Figure 4: WBS version 2 after validation.</w:t>
       </w:r>
-    </w:p>
-    <w:p>
-      <w:pPr>
-        <w:sectPr>
-          <w:pgSz w:w="16834" w:h="11909" w:orient="landscape"/>
-          <w:pgMar w:top="648" w:right="720" w:bottom="648" w:left="720" w:header="504" w:footer="504" w:gutter="0"/>
-          <w:cols w:space="720"/>
-          <w:docGrid w:linePitch="360"/>
-        </w:sectPr>
-      </w:pPr>
     </w:p>
     <w:p>
       <w:pPr>
@@ -17560,7 +17486,7 @@
       <w:r>
         <w:drawing>
           <wp:inline xmlns:a="http://schemas.openxmlformats.org/drawingml/2006/main" xmlns:pic="http://schemas.openxmlformats.org/drawingml/2006/picture">
-            <wp:extent cx="5715000" cy="3850560"/>
+            <wp:extent cx="5074920" cy="3419297"/>
             <wp:docPr id="7" name="Picture 7"/>
             <wp:cNvGraphicFramePr>
               <a:graphicFrameLocks noChangeAspect="1"/>
@@ -17581,7 +17507,7 @@
                   <pic:spPr>
                     <a:xfrm>
                       <a:off x="0" y="0"/>
-                      <a:ext cx="5715000" cy="3850560"/>
+                      <a:ext cx="5074920" cy="3419297"/>
                     </a:xfrm>
                     <a:prstGeom prst="rect"/>
                   </pic:spPr>
@@ -17674,7 +17600,7 @@
                 <w:rFonts w:ascii="Calibri" w:hAnsi="Calibri"/>
                 <w:b/>
                 <w:color w:val="212529"/>
-                <w:sz w:val="15"/>
+                <w:sz w:val="14"/>
               </w:rPr>
               <w:t>Name</w:t>
             </w:r>
@@ -17703,7 +17629,7 @@
                 <w:rFonts w:ascii="Calibri" w:hAnsi="Calibri"/>
                 <w:b/>
                 <w:color w:val="212529"/>
-                <w:sz w:val="15"/>
+                <w:sz w:val="14"/>
               </w:rPr>
               <w:t>Working Time</w:t>
             </w:r>
@@ -17732,7 +17658,7 @@
                 <w:rFonts w:ascii="Calibri" w:hAnsi="Calibri"/>
                 <w:b/>
                 <w:color w:val="212529"/>
-                <w:sz w:val="15"/>
+                <w:sz w:val="14"/>
               </w:rPr>
               <w:t>PM</w:t>
             </w:r>
@@ -17761,7 +17687,7 @@
                 <w:rFonts w:ascii="Calibri" w:hAnsi="Calibri"/>
                 <w:b/>
                 <w:color w:val="212529"/>
-                <w:sz w:val="15"/>
+                <w:sz w:val="14"/>
               </w:rPr>
               <w:t>Req.</w:t>
             </w:r>
@@ -17790,7 +17716,7 @@
                 <w:rFonts w:ascii="Calibri" w:hAnsi="Calibri"/>
                 <w:b/>
                 <w:color w:val="212529"/>
-                <w:sz w:val="15"/>
+                <w:sz w:val="14"/>
               </w:rPr>
               <w:t>Arch.</w:t>
             </w:r>
@@ -17819,7 +17745,7 @@
                 <w:rFonts w:ascii="Calibri" w:hAnsi="Calibri"/>
                 <w:b/>
                 <w:color w:val="212529"/>
-                <w:sz w:val="15"/>
+                <w:sz w:val="14"/>
               </w:rPr>
               <w:t>Prog.</w:t>
             </w:r>
@@ -17848,7 +17774,7 @@
                 <w:rFonts w:ascii="Calibri" w:hAnsi="Calibri"/>
                 <w:b/>
                 <w:color w:val="212529"/>
-                <w:sz w:val="15"/>
+                <w:sz w:val="14"/>
               </w:rPr>
               <w:t>Security/Test</w:t>
             </w:r>
@@ -17877,7 +17803,7 @@
                 <w:rFonts w:ascii="Calibri" w:hAnsi="Calibri"/>
                 <w:b/>
                 <w:color w:val="212529"/>
-                <w:sz w:val="15"/>
+                <w:sz w:val="14"/>
               </w:rPr>
               <w:t>UX/Marketing</w:t>
             </w:r>
@@ -17906,7 +17832,7 @@
                 <w:rFonts w:ascii="Calibri" w:hAnsi="Calibri"/>
                 <w:b/>
                 <w:color w:val="212529"/>
-                <w:sz w:val="15"/>
+                <w:sz w:val="14"/>
               </w:rPr>
               <w:t>Docs</w:t>
             </w:r>
@@ -17929,7 +17855,7 @@
                 <w:rFonts w:ascii="Calibri" w:hAnsi="Calibri"/>
                 <w:b w:val="0"/>
                 <w:color w:val="212529"/>
-                <w:sz w:val="15"/>
+                <w:sz w:val="14"/>
               </w:rPr>
               <w:t>Nguyen, Hieu</w:t>
             </w:r>
@@ -17950,7 +17876,7 @@
                 <w:rFonts w:ascii="Calibri" w:hAnsi="Calibri"/>
                 <w:b w:val="0"/>
                 <w:color w:val="212529"/>
-                <w:sz w:val="15"/>
+                <w:sz w:val="14"/>
               </w:rPr>
               <w:t>60%</w:t>
             </w:r>
@@ -17972,7 +17898,7 @@
                 <w:rFonts w:ascii="Calibri" w:hAnsi="Calibri"/>
                 <w:b w:val="0"/>
                 <w:color w:val="212529"/>
-                <w:sz w:val="15"/>
+                <w:sz w:val="14"/>
               </w:rPr>
               <w:t>3</w:t>
             </w:r>
@@ -17994,7 +17920,7 @@
                 <w:rFonts w:ascii="Calibri" w:hAnsi="Calibri"/>
                 <w:b w:val="0"/>
                 <w:color w:val="212529"/>
-                <w:sz w:val="15"/>
+                <w:sz w:val="14"/>
               </w:rPr>
               <w:t>3</w:t>
             </w:r>
@@ -18016,7 +17942,7 @@
                 <w:rFonts w:ascii="Calibri" w:hAnsi="Calibri"/>
                 <w:b w:val="0"/>
                 <w:color w:val="212529"/>
-                <w:sz w:val="15"/>
+                <w:sz w:val="14"/>
               </w:rPr>
               <w:t>4</w:t>
             </w:r>
@@ -18038,7 +17964,7 @@
                 <w:rFonts w:ascii="Calibri" w:hAnsi="Calibri"/>
                 <w:b w:val="0"/>
                 <w:color w:val="212529"/>
-                <w:sz w:val="15"/>
+                <w:sz w:val="14"/>
               </w:rPr>
               <w:t>5</w:t>
             </w:r>
@@ -18060,7 +17986,7 @@
                 <w:rFonts w:ascii="Calibri" w:hAnsi="Calibri"/>
                 <w:b w:val="0"/>
                 <w:color w:val="212529"/>
-                <w:sz w:val="15"/>
+                <w:sz w:val="14"/>
               </w:rPr>
               <w:t>4</w:t>
             </w:r>
@@ -18082,7 +18008,7 @@
                 <w:rFonts w:ascii="Calibri" w:hAnsi="Calibri"/>
                 <w:b w:val="0"/>
                 <w:color w:val="212529"/>
-                <w:sz w:val="15"/>
+                <w:sz w:val="14"/>
               </w:rPr>
               <w:t>2</w:t>
             </w:r>
@@ -18104,7 +18030,7 @@
                 <w:rFonts w:ascii="Calibri" w:hAnsi="Calibri"/>
                 <w:b w:val="0"/>
                 <w:color w:val="212529"/>
-                <w:sz w:val="15"/>
+                <w:sz w:val="14"/>
               </w:rPr>
               <w:t>3</w:t>
             </w:r>
@@ -18127,7 +18053,7 @@
                 <w:rFonts w:ascii="Calibri" w:hAnsi="Calibri"/>
                 <w:b w:val="0"/>
                 <w:color w:val="212529"/>
-                <w:sz w:val="15"/>
+                <w:sz w:val="14"/>
               </w:rPr>
               <w:t>Wang, Jingru</w:t>
             </w:r>
@@ -18148,7 +18074,7 @@
                 <w:rFonts w:ascii="Calibri" w:hAnsi="Calibri"/>
                 <w:b w:val="0"/>
                 <w:color w:val="212529"/>
-                <w:sz w:val="15"/>
+                <w:sz w:val="14"/>
               </w:rPr>
               <w:t>50%</w:t>
             </w:r>
@@ -18170,7 +18096,7 @@
                 <w:rFonts w:ascii="Calibri" w:hAnsi="Calibri"/>
                 <w:b w:val="0"/>
                 <w:color w:val="212529"/>
-                <w:sz w:val="15"/>
+                <w:sz w:val="14"/>
               </w:rPr>
               <w:t>3</w:t>
             </w:r>
@@ -18192,7 +18118,7 @@
                 <w:rFonts w:ascii="Calibri" w:hAnsi="Calibri"/>
                 <w:b w:val="0"/>
                 <w:color w:val="212529"/>
-                <w:sz w:val="15"/>
+                <w:sz w:val="14"/>
               </w:rPr>
               <w:t>5</w:t>
             </w:r>
@@ -18214,7 +18140,7 @@
                 <w:rFonts w:ascii="Calibri" w:hAnsi="Calibri"/>
                 <w:b w:val="0"/>
                 <w:color w:val="212529"/>
-                <w:sz w:val="15"/>
+                <w:sz w:val="14"/>
               </w:rPr>
               <w:t>3</w:t>
             </w:r>
@@ -18236,7 +18162,7 @@
                 <w:rFonts w:ascii="Calibri" w:hAnsi="Calibri"/>
                 <w:b w:val="0"/>
                 <w:color w:val="212529"/>
-                <w:sz w:val="15"/>
+                <w:sz w:val="14"/>
               </w:rPr>
               <w:t>3</w:t>
             </w:r>
@@ -18258,7 +18184,7 @@
                 <w:rFonts w:ascii="Calibri" w:hAnsi="Calibri"/>
                 <w:b w:val="0"/>
                 <w:color w:val="212529"/>
-                <w:sz w:val="15"/>
+                <w:sz w:val="14"/>
               </w:rPr>
               <w:t>3</w:t>
             </w:r>
@@ -18280,7 +18206,7 @@
                 <w:rFonts w:ascii="Calibri" w:hAnsi="Calibri"/>
                 <w:b w:val="0"/>
                 <w:color w:val="212529"/>
-                <w:sz w:val="15"/>
+                <w:sz w:val="14"/>
               </w:rPr>
               <w:t>4</w:t>
             </w:r>
@@ -18302,7 +18228,7 @@
                 <w:rFonts w:ascii="Calibri" w:hAnsi="Calibri"/>
                 <w:b w:val="0"/>
                 <w:color w:val="212529"/>
-                <w:sz w:val="15"/>
+                <w:sz w:val="14"/>
               </w:rPr>
               <w:t>5</w:t>
             </w:r>
@@ -18325,7 +18251,7 @@
                 <w:rFonts w:ascii="Calibri" w:hAnsi="Calibri"/>
                 <w:b w:val="0"/>
                 <w:color w:val="212529"/>
-                <w:sz w:val="15"/>
+                <w:sz w:val="14"/>
               </w:rPr>
               <w:t>Dinesha Shyamala, Prasad</w:t>
             </w:r>
@@ -18346,7 +18272,7 @@
                 <w:rFonts w:ascii="Calibri" w:hAnsi="Calibri"/>
                 <w:b w:val="0"/>
                 <w:color w:val="212529"/>
-                <w:sz w:val="15"/>
+                <w:sz w:val="14"/>
               </w:rPr>
               <w:t>60%</w:t>
             </w:r>
@@ -18368,7 +18294,7 @@
                 <w:rFonts w:ascii="Calibri" w:hAnsi="Calibri"/>
                 <w:b w:val="0"/>
                 <w:color w:val="212529"/>
-                <w:sz w:val="15"/>
+                <w:sz w:val="14"/>
               </w:rPr>
               <w:t>3</w:t>
             </w:r>
@@ -18390,7 +18316,7 @@
                 <w:rFonts w:ascii="Calibri" w:hAnsi="Calibri"/>
                 <w:b w:val="0"/>
                 <w:color w:val="212529"/>
-                <w:sz w:val="15"/>
+                <w:sz w:val="14"/>
               </w:rPr>
               <w:t>3</w:t>
             </w:r>
@@ -18412,7 +18338,7 @@
                 <w:rFonts w:ascii="Calibri" w:hAnsi="Calibri"/>
                 <w:b w:val="0"/>
                 <w:color w:val="212529"/>
-                <w:sz w:val="15"/>
+                <w:sz w:val="14"/>
               </w:rPr>
               <w:t>5</w:t>
             </w:r>
@@ -18434,7 +18360,7 @@
                 <w:rFonts w:ascii="Calibri" w:hAnsi="Calibri"/>
                 <w:b w:val="0"/>
                 <w:color w:val="212529"/>
-                <w:sz w:val="15"/>
+                <w:sz w:val="14"/>
               </w:rPr>
               <w:t>5</w:t>
             </w:r>
@@ -18456,7 +18382,7 @@
                 <w:rFonts w:ascii="Calibri" w:hAnsi="Calibri"/>
                 <w:b w:val="0"/>
                 <w:color w:val="212529"/>
-                <w:sz w:val="15"/>
+                <w:sz w:val="14"/>
               </w:rPr>
               <w:t>4</w:t>
             </w:r>
@@ -18478,7 +18404,7 @@
                 <w:rFonts w:ascii="Calibri" w:hAnsi="Calibri"/>
                 <w:b w:val="0"/>
                 <w:color w:val="212529"/>
-                <w:sz w:val="15"/>
+                <w:sz w:val="14"/>
               </w:rPr>
               <w:t>2</w:t>
             </w:r>
@@ -18500,7 +18426,7 @@
                 <w:rFonts w:ascii="Calibri" w:hAnsi="Calibri"/>
                 <w:b w:val="0"/>
                 <w:color w:val="212529"/>
-                <w:sz w:val="15"/>
+                <w:sz w:val="14"/>
               </w:rPr>
               <w:t>3</w:t>
             </w:r>
@@ -18523,7 +18449,7 @@
                 <w:rFonts w:ascii="Calibri" w:hAnsi="Calibri"/>
                 <w:b w:val="0"/>
                 <w:color w:val="212529"/>
-                <w:sz w:val="15"/>
+                <w:sz w:val="14"/>
               </w:rPr>
               <w:t>Yi, Jiahao</w:t>
             </w:r>
@@ -18544,7 +18470,7 @@
                 <w:rFonts w:ascii="Calibri" w:hAnsi="Calibri"/>
                 <w:b w:val="0"/>
                 <w:color w:val="212529"/>
-                <w:sz w:val="15"/>
+                <w:sz w:val="14"/>
               </w:rPr>
               <w:t>60%</w:t>
             </w:r>
@@ -18566,7 +18492,7 @@
                 <w:rFonts w:ascii="Calibri" w:hAnsi="Calibri"/>
                 <w:b w:val="0"/>
                 <w:color w:val="212529"/>
-                <w:sz w:val="15"/>
+                <w:sz w:val="14"/>
               </w:rPr>
               <w:t>5</w:t>
             </w:r>
@@ -18588,7 +18514,7 @@
                 <w:rFonts w:ascii="Calibri" w:hAnsi="Calibri"/>
                 <w:b w:val="0"/>
                 <w:color w:val="212529"/>
-                <w:sz w:val="15"/>
+                <w:sz w:val="14"/>
               </w:rPr>
               <w:t>3</w:t>
             </w:r>
@@ -18610,7 +18536,7 @@
                 <w:rFonts w:ascii="Calibri" w:hAnsi="Calibri"/>
                 <w:b w:val="0"/>
                 <w:color w:val="212529"/>
-                <w:sz w:val="15"/>
+                <w:sz w:val="14"/>
               </w:rPr>
               <w:t>4</w:t>
             </w:r>
@@ -18632,7 +18558,7 @@
                 <w:rFonts w:ascii="Calibri" w:hAnsi="Calibri"/>
                 <w:b w:val="0"/>
                 <w:color w:val="212529"/>
-                <w:sz w:val="15"/>
+                <w:sz w:val="14"/>
               </w:rPr>
               <w:t>4</w:t>
             </w:r>
@@ -18654,7 +18580,7 @@
                 <w:rFonts w:ascii="Calibri" w:hAnsi="Calibri"/>
                 <w:b w:val="0"/>
                 <w:color w:val="212529"/>
-                <w:sz w:val="15"/>
+                <w:sz w:val="14"/>
               </w:rPr>
               <w:t>3</w:t>
             </w:r>
@@ -18676,7 +18602,7 @@
                 <w:rFonts w:ascii="Calibri" w:hAnsi="Calibri"/>
                 <w:b w:val="0"/>
                 <w:color w:val="212529"/>
-                <w:sz w:val="15"/>
+                <w:sz w:val="14"/>
               </w:rPr>
               <w:t>3</w:t>
             </w:r>
@@ -18698,7 +18624,7 @@
                 <w:rFonts w:ascii="Calibri" w:hAnsi="Calibri"/>
                 <w:b w:val="0"/>
                 <w:color w:val="212529"/>
-                <w:sz w:val="15"/>
+                <w:sz w:val="14"/>
               </w:rPr>
               <w:t>4</w:t>
             </w:r>
@@ -18721,7 +18647,7 @@
                 <w:rFonts w:ascii="Calibri" w:hAnsi="Calibri"/>
                 <w:b w:val="0"/>
                 <w:color w:val="212529"/>
-                <w:sz w:val="15"/>
+                <w:sz w:val="14"/>
               </w:rPr>
               <w:t>Sun, Teng</w:t>
             </w:r>
@@ -18742,7 +18668,7 @@
                 <w:rFonts w:ascii="Calibri" w:hAnsi="Calibri"/>
                 <w:b w:val="0"/>
                 <w:color w:val="212529"/>
-                <w:sz w:val="15"/>
+                <w:sz w:val="14"/>
               </w:rPr>
               <w:t>50%</w:t>
             </w:r>
@@ -18764,7 +18690,7 @@
                 <w:rFonts w:ascii="Calibri" w:hAnsi="Calibri"/>
                 <w:b w:val="0"/>
                 <w:color w:val="212529"/>
-                <w:sz w:val="15"/>
+                <w:sz w:val="14"/>
               </w:rPr>
               <w:t>4</w:t>
             </w:r>
@@ -18786,7 +18712,7 @@
                 <w:rFonts w:ascii="Calibri" w:hAnsi="Calibri"/>
                 <w:b w:val="0"/>
                 <w:color w:val="212529"/>
-                <w:sz w:val="15"/>
+                <w:sz w:val="14"/>
               </w:rPr>
               <w:t>4</w:t>
             </w:r>
@@ -18808,7 +18734,7 @@
                 <w:rFonts w:ascii="Calibri" w:hAnsi="Calibri"/>
                 <w:b w:val="0"/>
                 <w:color w:val="212529"/>
-                <w:sz w:val="15"/>
+                <w:sz w:val="14"/>
               </w:rPr>
               <w:t>2</w:t>
             </w:r>
@@ -18830,7 +18756,7 @@
                 <w:rFonts w:ascii="Calibri" w:hAnsi="Calibri"/>
                 <w:b w:val="0"/>
                 <w:color w:val="212529"/>
-                <w:sz w:val="15"/>
+                <w:sz w:val="14"/>
               </w:rPr>
               <w:t>2</w:t>
             </w:r>
@@ -18852,7 +18778,7 @@
                 <w:rFonts w:ascii="Calibri" w:hAnsi="Calibri"/>
                 <w:b w:val="0"/>
                 <w:color w:val="212529"/>
-                <w:sz w:val="15"/>
+                <w:sz w:val="14"/>
               </w:rPr>
               <w:t>2</w:t>
             </w:r>
@@ -18874,7 +18800,7 @@
                 <w:rFonts w:ascii="Calibri" w:hAnsi="Calibri"/>
                 <w:b w:val="0"/>
                 <w:color w:val="212529"/>
-                <w:sz w:val="15"/>
+                <w:sz w:val="14"/>
               </w:rPr>
               <w:t>5</w:t>
             </w:r>
@@ -18896,7 +18822,7 @@
                 <w:rFonts w:ascii="Calibri" w:hAnsi="Calibri"/>
                 <w:b w:val="0"/>
                 <w:color w:val="212529"/>
-                <w:sz w:val="15"/>
+                <w:sz w:val="14"/>
               </w:rPr>
               <w:t>4</w:t>
             </w:r>
@@ -18919,7 +18845,7 @@
                 <w:rFonts w:ascii="Calibri" w:hAnsi="Calibri"/>
                 <w:b w:val="0"/>
                 <w:color w:val="212529"/>
-                <w:sz w:val="15"/>
+                <w:sz w:val="14"/>
               </w:rPr>
               <w:t>Guo, Ziyu</w:t>
             </w:r>
@@ -18940,7 +18866,7 @@
                 <w:rFonts w:ascii="Calibri" w:hAnsi="Calibri"/>
                 <w:b w:val="0"/>
                 <w:color w:val="212529"/>
-                <w:sz w:val="15"/>
+                <w:sz w:val="14"/>
               </w:rPr>
               <w:t>50%</w:t>
             </w:r>
@@ -18962,7 +18888,7 @@
                 <w:rFonts w:ascii="Calibri" w:hAnsi="Calibri"/>
                 <w:b w:val="0"/>
                 <w:color w:val="212529"/>
-                <w:sz w:val="15"/>
+                <w:sz w:val="14"/>
               </w:rPr>
               <w:t>3</w:t>
             </w:r>
@@ -18984,7 +18910,7 @@
                 <w:rFonts w:ascii="Calibri" w:hAnsi="Calibri"/>
                 <w:b w:val="0"/>
                 <w:color w:val="212529"/>
-                <w:sz w:val="15"/>
+                <w:sz w:val="14"/>
               </w:rPr>
               <w:t>3</w:t>
             </w:r>
@@ -19006,7 +18932,7 @@
                 <w:rFonts w:ascii="Calibri" w:hAnsi="Calibri"/>
                 <w:b w:val="0"/>
                 <w:color w:val="212529"/>
-                <w:sz w:val="15"/>
+                <w:sz w:val="14"/>
               </w:rPr>
               <w:t>4</w:t>
             </w:r>
@@ -19028,7 +18954,7 @@
                 <w:rFonts w:ascii="Calibri" w:hAnsi="Calibri"/>
                 <w:b w:val="0"/>
                 <w:color w:val="212529"/>
-                <w:sz w:val="15"/>
+                <w:sz w:val="14"/>
               </w:rPr>
               <w:t>4</w:t>
             </w:r>
@@ -19050,7 +18976,7 @@
                 <w:rFonts w:ascii="Calibri" w:hAnsi="Calibri"/>
                 <w:b w:val="0"/>
                 <w:color w:val="212529"/>
-                <w:sz w:val="15"/>
+                <w:sz w:val="14"/>
               </w:rPr>
               <w:t>5</w:t>
             </w:r>
@@ -19072,7 +18998,7 @@
                 <w:rFonts w:ascii="Calibri" w:hAnsi="Calibri"/>
                 <w:b w:val="0"/>
                 <w:color w:val="212529"/>
-                <w:sz w:val="15"/>
+                <w:sz w:val="14"/>
               </w:rPr>
               <w:t>3</w:t>
             </w:r>
@@ -19094,7 +19020,7 @@
                 <w:rFonts w:ascii="Calibri" w:hAnsi="Calibri"/>
                 <w:b w:val="0"/>
                 <w:color w:val="212529"/>
-                <w:sz w:val="15"/>
+                <w:sz w:val="14"/>
               </w:rPr>
               <w:t>3</w:t>
             </w:r>
@@ -19149,7 +19075,7 @@
                 <w:rFonts w:ascii="Calibri" w:hAnsi="Calibri"/>
                 <w:b/>
                 <w:color w:val="212529"/>
-                <w:sz w:val="15"/>
+                <w:sz w:val="13"/>
               </w:rPr>
               <w:t>Activity</w:t>
             </w:r>
@@ -19178,7 +19104,7 @@
                 <w:rFonts w:ascii="Calibri" w:hAnsi="Calibri"/>
                 <w:b/>
                 <w:color w:val="212529"/>
-                <w:sz w:val="15"/>
+                <w:sz w:val="13"/>
               </w:rPr>
               <w:t>Primary Skills</w:t>
             </w:r>
@@ -19207,7 +19133,7 @@
                 <w:rFonts w:ascii="Calibri" w:hAnsi="Calibri"/>
                 <w:b/>
                 <w:color w:val="212529"/>
-                <w:sz w:val="15"/>
+                <w:sz w:val="13"/>
               </w:rPr>
               <w:t>Assigned Members</w:t>
             </w:r>
@@ -19236,7 +19162,7 @@
                 <w:rFonts w:ascii="Calibri" w:hAnsi="Calibri"/>
                 <w:b/>
                 <w:color w:val="212529"/>
-                <w:sz w:val="15"/>
+                <w:sz w:val="13"/>
               </w:rPr>
               <w:t>Capacity Note</w:t>
             </w:r>
@@ -19259,7 +19185,7 @@
                 <w:rFonts w:ascii="Calibri" w:hAnsi="Calibri"/>
                 <w:b w:val="0"/>
                 <w:color w:val="212529"/>
-                <w:sz w:val="15"/>
+                <w:sz w:val="13"/>
               </w:rPr>
               <w:t>A1</w:t>
             </w:r>
@@ -19280,7 +19206,7 @@
                 <w:rFonts w:ascii="Calibri" w:hAnsi="Calibri"/>
                 <w:b w:val="0"/>
                 <w:color w:val="212529"/>
-                <w:sz w:val="15"/>
+                <w:sz w:val="13"/>
               </w:rPr>
               <w:t>PM, stakeholder management</w:t>
             </w:r>
@@ -19301,7 +19227,7 @@
                 <w:rFonts w:ascii="Calibri" w:hAnsi="Calibri"/>
                 <w:b w:val="0"/>
                 <w:color w:val="212529"/>
-                <w:sz w:val="15"/>
+                <w:sz w:val="13"/>
               </w:rPr>
               <w:t>Yi, Wang</w:t>
             </w:r>
@@ -19322,9 +19248,9 @@
                 <w:rFonts w:ascii="Calibri" w:hAnsi="Calibri"/>
                 <w:b w:val="0"/>
                 <w:color w:val="212529"/>
-                <w:sz w:val="15"/>
-              </w:rPr>
-              <w:t>Yi leads setup; Wang supports documentation and stakeholder records.</w:t>
+                <w:sz w:val="13"/>
+              </w:rPr>
+              <w:t>Setup, documentation, stakeholder records.</w:t>
             </w:r>
           </w:p>
         </w:tc>
@@ -19345,7 +19271,7 @@
                 <w:rFonts w:ascii="Calibri" w:hAnsi="Calibri"/>
                 <w:b w:val="0"/>
                 <w:color w:val="212529"/>
-                <w:sz w:val="15"/>
+                <w:sz w:val="13"/>
               </w:rPr>
               <w:t>A2</w:t>
             </w:r>
@@ -19366,7 +19292,7 @@
                 <w:rFonts w:ascii="Calibri" w:hAnsi="Calibri"/>
                 <w:b w:val="0"/>
                 <w:color w:val="212529"/>
-                <w:sz w:val="15"/>
+                <w:sz w:val="13"/>
               </w:rPr>
               <w:t>Requirements, documentation</w:t>
             </w:r>
@@ -19387,7 +19313,7 @@
                 <w:rFonts w:ascii="Calibri" w:hAnsi="Calibri"/>
                 <w:b w:val="0"/>
                 <w:color w:val="212529"/>
-                <w:sz w:val="15"/>
+                <w:sz w:val="13"/>
               </w:rPr>
               <w:t>Wang, Sun, Yi</w:t>
             </w:r>
@@ -19408,9 +19334,9 @@
                 <w:rFonts w:ascii="Calibri" w:hAnsi="Calibri"/>
                 <w:b w:val="0"/>
                 <w:color w:val="212529"/>
-                <w:sz w:val="15"/>
-              </w:rPr>
-              <w:t>Sun contributes market/supplier perspective; Yi resolves scope questions.</w:t>
+                <w:sz w:val="13"/>
+              </w:rPr>
+              <w:t>Requirements, market view, scope decisions.</w:t>
             </w:r>
           </w:p>
         </w:tc>
@@ -19431,7 +19357,7 @@
                 <w:rFonts w:ascii="Calibri" w:hAnsi="Calibri"/>
                 <w:b w:val="0"/>
                 <w:color w:val="212529"/>
-                <w:sz w:val="15"/>
+                <w:sz w:val="13"/>
               </w:rPr>
               <w:t>A3</w:t>
             </w:r>
@@ -19452,7 +19378,7 @@
                 <w:rFonts w:ascii="Calibri" w:hAnsi="Calibri"/>
                 <w:b w:val="0"/>
                 <w:color w:val="212529"/>
-                <w:sz w:val="15"/>
+                <w:sz w:val="13"/>
               </w:rPr>
               <w:t>Supplier analysis, PM</w:t>
             </w:r>
@@ -19473,7 +19399,7 @@
                 <w:rFonts w:ascii="Calibri" w:hAnsi="Calibri"/>
                 <w:b w:val="0"/>
                 <w:color w:val="212529"/>
-                <w:sz w:val="15"/>
+                <w:sz w:val="13"/>
               </w:rPr>
               <w:t>Sun, Yi, Wang</w:t>
             </w:r>
@@ -19494,9 +19420,9 @@
                 <w:rFonts w:ascii="Calibri" w:hAnsi="Calibri"/>
                 <w:b w:val="0"/>
                 <w:color w:val="212529"/>
-                <w:sz w:val="15"/>
-              </w:rPr>
-              <w:t>Sun leads commercial criteria; Yi handles decision traceability.</w:t>
+                <w:sz w:val="13"/>
+              </w:rPr>
+              <w:t>Commercial criteria and decision traceability.</w:t>
             </w:r>
           </w:p>
         </w:tc>
@@ -19517,7 +19443,7 @@
                 <w:rFonts w:ascii="Calibri" w:hAnsi="Calibri"/>
                 <w:b w:val="0"/>
                 <w:color w:val="212529"/>
-                <w:sz w:val="15"/>
+                <w:sz w:val="13"/>
               </w:rPr>
               <w:t>A4</w:t>
             </w:r>
@@ -19538,7 +19464,7 @@
                 <w:rFonts w:ascii="Calibri" w:hAnsi="Calibri"/>
                 <w:b w:val="0"/>
                 <w:color w:val="212529"/>
-                <w:sz w:val="15"/>
+                <w:sz w:val="13"/>
               </w:rPr>
               <w:t>Architecture, safety</w:t>
             </w:r>
@@ -19559,7 +19485,7 @@
                 <w:rFonts w:ascii="Calibri" w:hAnsi="Calibri"/>
                 <w:b w:val="0"/>
                 <w:color w:val="212529"/>
-                <w:sz w:val="15"/>
+                <w:sz w:val="13"/>
               </w:rPr>
               <w:t>Prasad, Nguyen, Guo</w:t>
             </w:r>
@@ -19580,9 +19506,9 @@
                 <w:rFonts w:ascii="Calibri" w:hAnsi="Calibri"/>
                 <w:b w:val="0"/>
                 <w:color w:val="212529"/>
-                <w:sz w:val="15"/>
-              </w:rPr>
-              <w:t>Architecture decisions reviewed with testing/security perspective.</w:t>
+                <w:sz w:val="13"/>
+              </w:rPr>
+              <w:t>Architecture reviewed with security/testing view.</w:t>
             </w:r>
           </w:p>
         </w:tc>
@@ -19603,7 +19529,7 @@
                 <w:rFonts w:ascii="Calibri" w:hAnsi="Calibri"/>
                 <w:b w:val="0"/>
                 <w:color w:val="212529"/>
-                <w:sz w:val="15"/>
+                <w:sz w:val="13"/>
               </w:rPr>
               <w:t>A5</w:t>
             </w:r>
@@ -19624,7 +19550,7 @@
                 <w:rFonts w:ascii="Calibri" w:hAnsi="Calibri"/>
                 <w:b w:val="0"/>
                 <w:color w:val="212529"/>
-                <w:sz w:val="15"/>
+                <w:sz w:val="13"/>
               </w:rPr>
               <w:t>Hardware/display, UX</w:t>
             </w:r>
@@ -19645,7 +19571,7 @@
                 <w:rFonts w:ascii="Calibri" w:hAnsi="Calibri"/>
                 <w:b w:val="0"/>
                 <w:color w:val="212529"/>
-                <w:sz w:val="15"/>
+                <w:sz w:val="13"/>
               </w:rPr>
               <w:t>Sun, Guo, Wang</w:t>
             </w:r>
@@ -19666,9 +19592,9 @@
                 <w:rFonts w:ascii="Calibri" w:hAnsi="Calibri"/>
                 <w:b w:val="0"/>
                 <w:color w:val="212529"/>
-                <w:sz w:val="15"/>
-              </w:rPr>
-              <w:t>Combines supplier information, usability concerns, and validation criteria.</w:t>
+                <w:sz w:val="13"/>
+              </w:rPr>
+              <w:t>Supplier data, usability, validation criteria.</w:t>
             </w:r>
           </w:p>
         </w:tc>
@@ -19689,7 +19615,7 @@
                 <w:rFonts w:ascii="Calibri" w:hAnsi="Calibri"/>
                 <w:b w:val="0"/>
                 <w:color w:val="212529"/>
-                <w:sz w:val="15"/>
+                <w:sz w:val="13"/>
               </w:rPr>
               <w:t>A6</w:t>
             </w:r>
@@ -19710,7 +19636,7 @@
                 <w:rFonts w:ascii="Calibri" w:hAnsi="Calibri"/>
                 <w:b w:val="0"/>
                 <w:color w:val="212529"/>
-                <w:sz w:val="15"/>
+                <w:sz w:val="13"/>
               </w:rPr>
               <w:t>Programming, architecture</w:t>
             </w:r>
@@ -19731,7 +19657,7 @@
                 <w:rFonts w:ascii="Calibri" w:hAnsi="Calibri"/>
                 <w:b w:val="0"/>
                 <w:color w:val="212529"/>
-                <w:sz w:val="15"/>
+                <w:sz w:val="13"/>
               </w:rPr>
               <w:t>Nguyen, Yi, Prasad</w:t>
             </w:r>
@@ -19752,9 +19678,9 @@
                 <w:rFonts w:ascii="Calibri" w:hAnsi="Calibri"/>
                 <w:b w:val="0"/>
                 <w:color w:val="212529"/>
-                <w:sz w:val="15"/>
-              </w:rPr>
-              <w:t>Main development effort; capacity protected from reporting tasks.</w:t>
+                <w:sz w:val="13"/>
+              </w:rPr>
+              <w:t>Main hosting application development.</w:t>
             </w:r>
           </w:p>
         </w:tc>
@@ -19775,7 +19701,7 @@
                 <w:rFonts w:ascii="Calibri" w:hAnsi="Calibri"/>
                 <w:b w:val="0"/>
                 <w:color w:val="212529"/>
-                <w:sz w:val="15"/>
+                <w:sz w:val="13"/>
               </w:rPr>
               <w:t>A7</w:t>
             </w:r>
@@ -19796,7 +19722,7 @@
                 <w:rFonts w:ascii="Calibri" w:hAnsi="Calibri"/>
                 <w:b w:val="0"/>
                 <w:color w:val="212529"/>
-                <w:sz w:val="15"/>
+                <w:sz w:val="13"/>
               </w:rPr>
               <w:t>Programming, UX</w:t>
             </w:r>
@@ -19817,7 +19743,7 @@
                 <w:rFonts w:ascii="Calibri" w:hAnsi="Calibri"/>
                 <w:b w:val="0"/>
                 <w:color w:val="212529"/>
-                <w:sz w:val="15"/>
+                <w:sz w:val="13"/>
               </w:rPr>
               <w:t>Wang, Nguyen</w:t>
             </w:r>
@@ -19838,9 +19764,9 @@
                 <w:rFonts w:ascii="Calibri" w:hAnsi="Calibri"/>
                 <w:b w:val="0"/>
                 <w:color w:val="212529"/>
-                <w:sz w:val="15"/>
-              </w:rPr>
-              <w:t>GUI work aligned with module configuration needs.</w:t>
+                <w:sz w:val="13"/>
+              </w:rPr>
+              <w:t>GUI and module configuration flows.</w:t>
             </w:r>
           </w:p>
         </w:tc>
@@ -19861,7 +19787,7 @@
                 <w:rFonts w:ascii="Calibri" w:hAnsi="Calibri"/>
                 <w:b w:val="0"/>
                 <w:color w:val="212529"/>
-                <w:sz w:val="15"/>
+                <w:sz w:val="13"/>
               </w:rPr>
               <w:t>A8</w:t>
             </w:r>
@@ -19882,7 +19808,7 @@
                 <w:rFonts w:ascii="Calibri" w:hAnsi="Calibri"/>
                 <w:b w:val="0"/>
                 <w:color w:val="212529"/>
-                <w:sz w:val="15"/>
+                <w:sz w:val="13"/>
               </w:rPr>
               <w:t>Programming, integration</w:t>
             </w:r>
@@ -19903,7 +19829,7 @@
                 <w:rFonts w:ascii="Calibri" w:hAnsi="Calibri"/>
                 <w:b w:val="0"/>
                 <w:color w:val="212529"/>
-                <w:sz w:val="15"/>
+                <w:sz w:val="13"/>
               </w:rPr>
               <w:t>Prasad, Guo</w:t>
             </w:r>
@@ -19924,9 +19850,9 @@
                 <w:rFonts w:ascii="Calibri" w:hAnsi="Calibri"/>
                 <w:b w:val="0"/>
                 <w:color w:val="212529"/>
-                <w:sz w:val="15"/>
-              </w:rPr>
-              <w:t>WH receives strong integration and testing coverage.</w:t>
+                <w:sz w:val="13"/>
+              </w:rPr>
+              <w:t>WH integration and testing coverage.</w:t>
             </w:r>
           </w:p>
         </w:tc>
@@ -19947,7 +19873,7 @@
                 <w:rFonts w:ascii="Calibri" w:hAnsi="Calibri"/>
                 <w:b w:val="0"/>
                 <w:color w:val="212529"/>
-                <w:sz w:val="15"/>
+                <w:sz w:val="13"/>
               </w:rPr>
               <w:t>A9</w:t>
             </w:r>
@@ -19968,7 +19894,7 @@
                 <w:rFonts w:ascii="Calibri" w:hAnsi="Calibri"/>
                 <w:b w:val="0"/>
                 <w:color w:val="212529"/>
-                <w:sz w:val="15"/>
+                <w:sz w:val="13"/>
               </w:rPr>
               <w:t>Programming, integration</w:t>
             </w:r>
@@ -19989,7 +19915,7 @@
                 <w:rFonts w:ascii="Calibri" w:hAnsi="Calibri"/>
                 <w:b w:val="0"/>
                 <w:color w:val="212529"/>
-                <w:sz w:val="15"/>
+                <w:sz w:val="13"/>
               </w:rPr>
               <w:t>Nguyen, Wang</w:t>
             </w:r>
@@ -20010,9 +19936,9 @@
                 <w:rFonts w:ascii="Calibri" w:hAnsi="Calibri"/>
                 <w:b w:val="0"/>
                 <w:color w:val="212529"/>
-                <w:sz w:val="15"/>
-              </w:rPr>
-              <w:t>SC smaller than WH but still requires cloud/location logic.</w:t>
+                <w:sz w:val="13"/>
+              </w:rPr>
+              <w:t>SC cloud/location logic.</w:t>
             </w:r>
           </w:p>
         </w:tc>
@@ -20033,7 +19959,7 @@
                 <w:rFonts w:ascii="Calibri" w:hAnsi="Calibri"/>
                 <w:b w:val="0"/>
                 <w:color w:val="212529"/>
-                <w:sz w:val="15"/>
+                <w:sz w:val="13"/>
               </w:rPr>
               <w:t>A10</w:t>
             </w:r>
@@ -20054,7 +19980,7 @@
                 <w:rFonts w:ascii="Calibri" w:hAnsi="Calibri"/>
                 <w:b w:val="0"/>
                 <w:color w:val="212529"/>
-                <w:sz w:val="15"/>
+                <w:sz w:val="13"/>
               </w:rPr>
               <w:t>Cloud/API integration</w:t>
             </w:r>
@@ -20075,7 +20001,7 @@
                 <w:rFonts w:ascii="Calibri" w:hAnsi="Calibri"/>
                 <w:b w:val="0"/>
                 <w:color w:val="212529"/>
-                <w:sz w:val="15"/>
+                <w:sz w:val="13"/>
               </w:rPr>
               <w:t>Guo, Nguyen, Prasad</w:t>
             </w:r>
@@ -20096,9 +20022,9 @@
                 <w:rFonts w:ascii="Calibri" w:hAnsi="Calibri"/>
                 <w:b w:val="0"/>
                 <w:color w:val="212529"/>
-                <w:sz w:val="15"/>
-              </w:rPr>
-              <w:t>Technical integration begins only after supplier-dependent work is stable.</w:t>
+                <w:sz w:val="13"/>
+              </w:rPr>
+              <w:t>Technical integration after supplier work.</w:t>
             </w:r>
           </w:p>
         </w:tc>
@@ -20119,7 +20045,7 @@
                 <w:rFonts w:ascii="Calibri" w:hAnsi="Calibri"/>
                 <w:b w:val="0"/>
                 <w:color w:val="212529"/>
-                <w:sz w:val="15"/>
+                <w:sz w:val="13"/>
               </w:rPr>
               <w:t>A11</w:t>
             </w:r>
@@ -20140,7 +20066,7 @@
                 <w:rFonts w:ascii="Calibri" w:hAnsi="Calibri"/>
                 <w:b w:val="0"/>
                 <w:color w:val="212529"/>
-                <w:sz w:val="15"/>
+                <w:sz w:val="13"/>
               </w:rPr>
               <w:t>Testing, security, usability</w:t>
             </w:r>
@@ -20161,7 +20087,7 @@
                 <w:rFonts w:ascii="Calibri" w:hAnsi="Calibri"/>
                 <w:b w:val="0"/>
                 <w:color w:val="212529"/>
-                <w:sz w:val="15"/>
+                <w:sz w:val="13"/>
               </w:rPr>
               <w:t>Guo, Prasad, Wang</w:t>
             </w:r>
@@ -20182,9 +20108,9 @@
                 <w:rFonts w:ascii="Calibri" w:hAnsi="Calibri"/>
                 <w:b w:val="0"/>
                 <w:color w:val="212529"/>
-                <w:sz w:val="15"/>
-              </w:rPr>
-              <w:t>Testing-heavy phase with usability and privacy review.</w:t>
+                <w:sz w:val="13"/>
+              </w:rPr>
+              <w:t>Usability, privacy, and security review.</w:t>
             </w:r>
           </w:p>
         </w:tc>
@@ -20205,7 +20131,7 @@
                 <w:rFonts w:ascii="Calibri" w:hAnsi="Calibri"/>
                 <w:b w:val="0"/>
                 <w:color w:val="212529"/>
-                <w:sz w:val="15"/>
+                <w:sz w:val="13"/>
               </w:rPr>
               <w:t>A12</w:t>
             </w:r>
@@ -20226,7 +20152,7 @@
                 <w:rFonts w:ascii="Calibri" w:hAnsi="Calibri"/>
                 <w:b w:val="0"/>
                 <w:color w:val="212529"/>
-                <w:sz w:val="15"/>
+                <w:sz w:val="13"/>
               </w:rPr>
               <w:t>Deployment, documentation</w:t>
             </w:r>
@@ -20247,7 +20173,7 @@
                 <w:rFonts w:ascii="Calibri" w:hAnsi="Calibri"/>
                 <w:b w:val="0"/>
                 <w:color w:val="212529"/>
-                <w:sz w:val="15"/>
+                <w:sz w:val="13"/>
               </w:rPr>
               <w:t>Yi, Sun, Wang</w:t>
             </w:r>
@@ -20268,9 +20194,9 @@
                 <w:rFonts w:ascii="Calibri" w:hAnsi="Calibri"/>
                 <w:b w:val="0"/>
                 <w:color w:val="212529"/>
-                <w:sz w:val="15"/>
-              </w:rPr>
-              <w:t>Release package, stakeholder communication, and handover documents.</w:t>
+                <w:sz w:val="13"/>
+              </w:rPr>
+              <w:t>Release package and handover documents.</w:t>
             </w:r>
           </w:p>
         </w:tc>
@@ -20291,7 +20217,7 @@
                 <w:rFonts w:ascii="Calibri" w:hAnsi="Calibri"/>
                 <w:b w:val="0"/>
                 <w:color w:val="212529"/>
-                <w:sz w:val="15"/>
+                <w:sz w:val="13"/>
               </w:rPr>
               <w:t>A13</w:t>
             </w:r>
@@ -20312,7 +20238,7 @@
                 <w:rFonts w:ascii="Calibri" w:hAnsi="Calibri"/>
                 <w:b w:val="0"/>
                 <w:color w:val="212529"/>
-                <w:sz w:val="15"/>
+                <w:sz w:val="13"/>
               </w:rPr>
               <w:t>Operations readiness</w:t>
             </w:r>
@@ -20333,7 +20259,7 @@
                 <w:rFonts w:ascii="Calibri" w:hAnsi="Calibri"/>
                 <w:b w:val="0"/>
                 <w:color w:val="212529"/>
-                <w:sz w:val="15"/>
+                <w:sz w:val="13"/>
               </w:rPr>
               <w:t>Yi, Wang</w:t>
             </w:r>
@@ -20354,9 +20280,9 @@
                 <w:rFonts w:ascii="Calibri" w:hAnsi="Calibri"/>
                 <w:b w:val="0"/>
                 <w:color w:val="212529"/>
-                <w:sz w:val="15"/>
-              </w:rPr>
-              <w:t>Runs near pilot start to ensure support readiness.</w:t>
+                <w:sz w:val="13"/>
+              </w:rPr>
+              <w:t>Support readiness near pilot start.</w:t>
             </w:r>
           </w:p>
         </w:tc>
@@ -20377,7 +20303,7 @@
                 <w:rFonts w:ascii="Calibri" w:hAnsi="Calibri"/>
                 <w:b w:val="0"/>
                 <w:color w:val="212529"/>
-                <w:sz w:val="15"/>
+                <w:sz w:val="13"/>
               </w:rPr>
               <w:t>A14</w:t>
             </w:r>
@@ -20398,7 +20324,7 @@
                 <w:rFonts w:ascii="Calibri" w:hAnsi="Calibri"/>
                 <w:b w:val="0"/>
                 <w:color w:val="212529"/>
-                <w:sz w:val="15"/>
+                <w:sz w:val="13"/>
               </w:rPr>
               <w:t>Closure</w:t>
             </w:r>
@@ -20419,7 +20345,7 @@
                 <w:rFonts w:ascii="Calibri" w:hAnsi="Calibri"/>
                 <w:b w:val="0"/>
                 <w:color w:val="212529"/>
-                <w:sz w:val="15"/>
+                <w:sz w:val="13"/>
               </w:rPr>
               <w:t>All members</w:t>
             </w:r>
@@ -20440,9 +20366,9 @@
                 <w:rFonts w:ascii="Calibri" w:hAnsi="Calibri"/>
                 <w:b w:val="0"/>
                 <w:color w:val="212529"/>
-                <w:sz w:val="15"/>
-              </w:rPr>
-              <w:t>Final review and project closure are shared by the whole team.</w:t>
+                <w:sz w:val="13"/>
+              </w:rPr>
+              <w:t>Final review and project closure.</w:t>
             </w:r>
           </w:p>
         </w:tc>
@@ -20477,25 +20403,12 @@
           <w:color w:val="212529"/>
           <w:sz w:val="21"/>
         </w:rPr>
-        <w:t>The iGEO project is feasible if TOMI treats safety separation, supplier maturity, and stakeholder alignment as core management topics rather than late quality checks. The optimized WBS contains twelve work packages, ProfCar is selected as the preferred supplier, the Use Case Point estimate gives approximately 121 UCP and 2,412 person-hours of development effort, and the activity network produces a 37-week critical-path schedule within the one-year constraint.</w:t>
-      </w:r>
-    </w:p>
-    <w:p>
-      <w:pPr>
-        <w:spacing w:after="120" w:line="264" w:lineRule="auto"/>
-      </w:pPr>
-      <w:r>
-        <w:rPr>
-          <w:rFonts w:ascii="Calibri" w:hAnsi="Calibri"/>
-          <w:b w:val="0"/>
-          <w:i w:val="0"/>
-          <w:color w:val="212529"/>
-          <w:sz w:val="21"/>
-        </w:rPr>
-        <w:t>The main residual risks are requirements volatility, security/privacy exposure, supplier dependency, and acceptance of the Smart Commercials module. These risks are addressed through early stakeholder involvement, controlled supplier selection, explicit security/privacy validation, and a pilot release before final handover.</w:t>
+        <w:t>The iGEO project is feasible if TOMI treats safety separation, supplier maturity, stakeholder alignment, and privacy validation as core management topics. The optimized WBS contains twelve work packages, ProfCar is selected as the preferred supplier, the Use Case Point estimate gives approximately 121 UCP and 2,412 person-hours, and the activity network produces a 37-week critical-path schedule within the one-year constraint. The main residual risks are requirements volatility, supplier dependency, and user acceptance of the Smart Commercials module; these are addressed through early stakeholder involvement, controlled supplier selection, explicit validation, and a pilot release.</w:t>
       </w:r>
     </w:p>
     <w:sectPr>
+      <w:headerReference w:type="default" r:id="rId9"/>
+      <w:footerReference w:type="default" r:id="rId10"/>
       <w:pgSz w:w="11909" w:h="16834"/>
       <w:pgMar w:top="1123" w:right="1181" w:bottom="1123" w:left="1181" w:header="504" w:footer="504" w:gutter="0"/>
       <w:cols w:space="720"/>

</xml_diff>

<commit_message>
Correct member name order
(cherry picked from commit 57a51a6f926642a4629cb5bf2d1fa26812218ecf)
</commit_message>
<xml_diff>
--- a/final-submission/GROUP_1.docx
+++ b/final-submission/GROUP_1.docx
@@ -94,7 +94,7 @@
           <w:color w:val="212529"/>
           <w:sz w:val="23"/>
         </w:rPr>
-        <w:t>Nguyen, Hieu</w:t>
+        <w:t>Hieu Nguyen</w:t>
       </w:r>
     </w:p>
     <w:p>
@@ -107,7 +107,7 @@
           <w:color w:val="212529"/>
           <w:sz w:val="23"/>
         </w:rPr>
-        <w:t>Wang, Jingru</w:t>
+        <w:t>Jingru Wang</w:t>
       </w:r>
     </w:p>
     <w:p>
@@ -120,7 +120,7 @@
           <w:color w:val="212529"/>
           <w:sz w:val="23"/>
         </w:rPr>
-        <w:t>Dinesha Shyamala, Prasad</w:t>
+        <w:t>Prasad Dinesha Shyamala</w:t>
       </w:r>
     </w:p>
     <w:p>
@@ -133,7 +133,7 @@
           <w:color w:val="212529"/>
           <w:sz w:val="23"/>
         </w:rPr>
-        <w:t>Yi, Jiahao</w:t>
+        <w:t>Jiahao Yi</w:t>
       </w:r>
     </w:p>
     <w:p>
@@ -146,7 +146,7 @@
           <w:color w:val="212529"/>
           <w:sz w:val="23"/>
         </w:rPr>
-        <w:t>Sun, Teng</w:t>
+        <w:t>Teng Sun</w:t>
       </w:r>
     </w:p>
     <w:p>
@@ -159,7 +159,7 @@
           <w:color w:val="212529"/>
           <w:sz w:val="23"/>
         </w:rPr>
-        <w:t>Guo, Ziyu</w:t>
+        <w:t>Ziyu Guo</w:t>
       </w:r>
     </w:p>
     <w:p/>
@@ -17857,7 +17857,7 @@
                 <w:color w:val="212529"/>
                 <w:sz w:val="14"/>
               </w:rPr>
-              <w:t>Nguyen, Hieu</w:t>
+              <w:t>Hieu Nguyen</w:t>
             </w:r>
           </w:p>
         </w:tc>
@@ -18055,7 +18055,7 @@
                 <w:color w:val="212529"/>
                 <w:sz w:val="14"/>
               </w:rPr>
-              <w:t>Wang, Jingru</w:t>
+              <w:t>Jingru Wang</w:t>
             </w:r>
           </w:p>
         </w:tc>
@@ -18253,7 +18253,7 @@
                 <w:color w:val="212529"/>
                 <w:sz w:val="14"/>
               </w:rPr>
-              <w:t>Dinesha Shyamala, Prasad</w:t>
+              <w:t>Prasad Dinesha Shyamala</w:t>
             </w:r>
           </w:p>
         </w:tc>
@@ -18451,7 +18451,7 @@
                 <w:color w:val="212529"/>
                 <w:sz w:val="14"/>
               </w:rPr>
-              <w:t>Yi, Jiahao</w:t>
+              <w:t>Jiahao Yi</w:t>
             </w:r>
           </w:p>
         </w:tc>
@@ -18649,7 +18649,7 @@
                 <w:color w:val="212529"/>
                 <w:sz w:val="14"/>
               </w:rPr>
-              <w:t>Sun, Teng</w:t>
+              <w:t>Teng Sun</w:t>
             </w:r>
           </w:p>
         </w:tc>
@@ -18847,7 +18847,7 @@
                 <w:color w:val="212529"/>
                 <w:sz w:val="14"/>
               </w:rPr>
-              <w:t>Guo, Ziyu</w:t>
+              <w:t>Ziyu Guo</w:t>
             </w:r>
           </w:p>
         </w:tc>

</xml_diff>